<commit_message>
Add Clause 7: Post-Completion Reserved Control of the Transferor
Podocarpus drops to 49% post-Completion while the two Transferees combine to
51%. To preserve Podocarpus's intended absolute decision-making power, the new
Clause 7 introduces:

- Irrevocable voting undertaking + irrevocable proxy from each Transferee
- Casting / deciding vote for the Transferor on disputed matters
- Sole right to nominate and appoint the General Manager
- Reserved Matters list requiring Transferor's prior written consent
- Entrenchment of (i)-(iv) in the amended MOA at Completion
- Specific performance + no waiver without Founder consent

Subsequent clauses (8-16) renumbered; recital E, cross-references in Clauses
8.3, 14.3, 16.2 and 16.6, and Schedule 5 updated accordingly.

Co-Authored-By: Claude Opus 4.7 <noreply@anthropic.com>
Claude-Session: https://claude.ai/code/session_014mwwfqbFKEAkUMUbkPpDvK
</commit_message>
<xml_diff>
--- a/agreements/Orizuru_Share_Transfer_Agreement.docx
+++ b/agreements/Orizuru_Share_Transfer_Agreement.docx
@@ -1455,7 +1455,27 @@
           <w:color w:val="1A1A1A"/>
           <w:sz w:val="21"/>
         </w:rPr>
-        <w:t>; and (ii) no transfer shall occur unless and until the Performance Threshold is satisfied.</w:t>
+        <w:t xml:space="preserve">; (ii) no transfer shall occur unless and until the Performance Threshold is satisfied; and (iii) notwithstanding that the Transferor’s holding will reduce to 49% and the Transferees’ combined holding will become 51% upon Completion, the Transferor (acting by the Founder) shall </w:t>
+      </w:r>
+      <w:r>
+        <w:rPr>
+          <w:rFonts w:ascii="Georgia" w:hAnsi="Georgia"/>
+          <w:b/>
+          <w:i w:val="0"/>
+          <w:color w:val="1A1A1A"/>
+          <w:sz w:val="21"/>
+        </w:rPr>
+        <w:t>retain absolute decision-making power and control over the Company</w:t>
+      </w:r>
+      <w:r>
+        <w:rPr>
+          <w:rFonts w:ascii="Georgia" w:hAnsi="Georgia"/>
+          <w:b w:val="0"/>
+          <w:i w:val="0"/>
+          <w:color w:val="1A1A1A"/>
+          <w:sz w:val="21"/>
+        </w:rPr>
+        <w:t xml:space="preserve"> following Completion, on the terms set out in Clause 7.</w:t>
       </w:r>
     </w:p>
     <w:p>
@@ -3295,7 +3315,7 @@
           <w:color w:val="0E2A47"/>
           <w:sz w:val="23"/>
         </w:rPr>
-        <w:t>CONSIDERATION</w:t>
+        <w:t>POST-COMPLETION GOVERNANCE: RESERVED CONTROL OF THE TRANSFEROR</w:t>
       </w:r>
     </w:p>
     <w:p>
@@ -3332,7 +3352,6 @@
           <w:color w:val="1A1A1A"/>
           <w:sz w:val="21"/>
         </w:rPr>
-        <w:t xml:space="preserve">In consideration of the achievement of the Performance Threshold and the past and continuing performance and services of the Transferees, the Transfer Shares shall be transferred to the Transferees for an </w:t>
       </w:r>
       <w:r>
         <w:rPr>
@@ -3342,7 +3361,7 @@
           <w:color w:val="1A1A1A"/>
           <w:sz w:val="21"/>
         </w:rPr>
-        <w:t>aggregate nominal consideration of AED 1.00 (one UAE Dirham)</w:t>
+        <w:t>Fundamental Condition; Retention of Absolute Decision-Making.</w:t>
       </w:r>
       <w:r>
         <w:rPr>
@@ -3352,7 +3371,27 @@
           <w:color w:val="1A1A1A"/>
           <w:sz w:val="21"/>
         </w:rPr>
-        <w:t xml:space="preserve"> (or such nominal/par amount as the Notary Public may require to be stated), the receipt and adequacy of which the Transferor acknowledges.</w:t>
+        <w:t xml:space="preserve"> The Parties acknowledge and agree that, although the Transferor’s shareholding will reduce from 70% to 49% upon Completion and the Transferees’ combined holding will increase to 51%, it is the express and fundamental intention of the Parties that the Transferor (acting by the Founder) shall </w:t>
+      </w:r>
+      <w:r>
+        <w:rPr>
+          <w:rFonts w:ascii="Georgia" w:hAnsi="Georgia"/>
+          <w:b/>
+          <w:i w:val="0"/>
+          <w:color w:val="1A1A1A"/>
+          <w:sz w:val="21"/>
+        </w:rPr>
+        <w:t>retain absolute decision-making power and control over the Company</w:t>
+      </w:r>
+      <w:r>
+        <w:rPr>
+          <w:rFonts w:ascii="Georgia" w:hAnsi="Georgia"/>
+          <w:b w:val="0"/>
+          <w:i w:val="0"/>
+          <w:color w:val="1A1A1A"/>
+          <w:sz w:val="21"/>
+        </w:rPr>
+        <w:t xml:space="preserve"> at all times following Completion. This is a fundamental basis upon which the Transferor has agreed to transfer the Transfer Shares, and the Transferees would not have been offered, and shall not be entitled to receive or to retain, the Transfer Shares but for the arrangements set out in this Clause 7.</w:t>
       </w:r>
     </w:p>
     <w:p>
@@ -3389,7 +3428,6 @@
           <w:color w:val="1A1A1A"/>
           <w:sz w:val="21"/>
         </w:rPr>
-        <w:t xml:space="preserve">The Parties confirm that the transfer is by way of a </w:t>
       </w:r>
       <w:r>
         <w:rPr>
@@ -3399,7 +3437,7 @@
           <w:color w:val="1A1A1A"/>
           <w:sz w:val="21"/>
         </w:rPr>
-        <w:t>performance reward and incentive</w:t>
+        <w:t>Irrevocable Voting Undertaking.</w:t>
       </w:r>
       <w:r>
         <w:rPr>
@@ -3409,7 +3447,7 @@
           <w:color w:val="1A1A1A"/>
           <w:sz w:val="21"/>
         </w:rPr>
-        <w:t xml:space="preserve"> and is not a sale at market value. Each Party shall bear its own tax position arising from the transfer and shall be responsible for obtaining its own independent tax advice (including in relation to UAE Corporate Tax and any applicable VAT).</w:t>
+        <w:t xml:space="preserve"> Each Transferee irrevocably undertakes and covenants to the Transferor that, in respect of every matter put to a vote of the shareholders of the Company (whether at an ordinary general assembly, an extraordinary general assembly, by written resolution or otherwise) and in respect of all consents, approvals and decisions of the shareholders, he shall: (a) vote (and procure that any proxy or representative on his behalf shall vote) all of the shares held by him strictly in accordance with the written instructions of the Transferor (acting by the Founder); and (b) abstain from voting where so instructed in writing by the Transferor.</w:t>
       </w:r>
     </w:p>
     <w:p>
@@ -3446,43 +3484,46 @@
           <w:color w:val="1A1A1A"/>
           <w:sz w:val="21"/>
         </w:rPr>
-        <w:t>Nothing in this Clause 7 limits the Founder’s discretion under Clause 5 or obliges the Transferor to transfer the Transfer Shares otherwise than in accordance with this Agreement.</w:t>
-      </w:r>
-    </w:p>
-    <w:p>
-      <w:pPr>
-        <w:keepNext/>
-        <w:spacing w:before="280" w:after="80"/>
-      </w:pPr>
-      <w:r>
-        <w:rPr>
-          <w:rFonts w:ascii="Calibri" w:hAnsi="Calibri"/>
+      </w:r>
+      <w:r>
+        <w:rPr>
+          <w:rFonts w:ascii="Georgia" w:hAnsi="Georgia"/>
           <w:b/>
           <w:i w:val="0"/>
-          <w:color w:val="0E2A47"/>
-          <w:sz w:val="23"/>
-        </w:rPr>
-        <w:t>8.</w:t>
-      </w:r>
-      <w:r>
-        <w:rPr>
-          <w:rFonts w:ascii="Calibri" w:hAnsi="Calibri"/>
+          <w:color w:val="1A1A1A"/>
+          <w:sz w:val="21"/>
+        </w:rPr>
+        <w:t>Irrevocable Proxy and Power of Attorney.</w:t>
+      </w:r>
+      <w:r>
+        <w:rPr>
+          <w:rFonts w:ascii="Georgia" w:hAnsi="Georgia"/>
+          <w:b w:val="0"/>
+          <w:i w:val="0"/>
+          <w:color w:val="1A1A1A"/>
+          <w:sz w:val="21"/>
+        </w:rPr>
+        <w:t xml:space="preserve"> As security for the undertaking in Clause 7.2, each Transferee shall, at Completion and from time to time thereafter at the request of the Transferor, execute an irrevocable proxy and power of attorney in favour of the Transferor (or its nominee) authorising the Transferor to attend, speak and vote at all meetings of the shareholders of the Company in respect of the Transferee’s shares, and to execute on the Transferee’s behalf any written resolution or shareholder consent. To the maximum extent permitted by Applicable Law, such proxy and power of attorney shall be </w:t>
+      </w:r>
+      <w:r>
+        <w:rPr>
+          <w:rFonts w:ascii="Georgia" w:hAnsi="Georgia"/>
           <w:b/>
           <w:i w:val="0"/>
-          <w:color w:val="0E2A47"/>
-          <w:sz w:val="23"/>
-        </w:rPr>
-        <w:t xml:space="preserve">   </w:t>
-      </w:r>
-      <w:r>
-        <w:rPr>
-          <w:rFonts w:ascii="Calibri" w:hAnsi="Calibri"/>
-          <w:b/>
-          <w:i w:val="0"/>
-          <w:color w:val="0E2A47"/>
-          <w:sz w:val="23"/>
-        </w:rPr>
-        <w:t>WAIVER OF PRE-EMPTION RIGHTS</w:t>
+          <w:color w:val="1A1A1A"/>
+          <w:sz w:val="21"/>
+        </w:rPr>
+        <w:t>irrevocable and coupled with an interest</w:t>
+      </w:r>
+      <w:r>
+        <w:rPr>
+          <w:rFonts w:ascii="Georgia" w:hAnsi="Georgia"/>
+          <w:b w:val="0"/>
+          <w:i w:val="0"/>
+          <w:color w:val="1A1A1A"/>
+          <w:sz w:val="21"/>
+        </w:rPr>
+        <w:t>.</w:t>
       </w:r>
     </w:p>
     <w:p>
@@ -3499,7 +3540,7 @@
           <w:color w:val="0E2A47"/>
           <w:sz w:val="21"/>
         </w:rPr>
-        <w:t>8.1</w:t>
+        <w:t>7.4</w:t>
       </w:r>
       <w:r>
         <w:rPr>
@@ -3519,7 +3560,6 @@
           <w:color w:val="1A1A1A"/>
           <w:sz w:val="21"/>
         </w:rPr>
-        <w:t xml:space="preserve">Each shareholder of the Company (including the Transferees) irrevocably and unconditionally </w:t>
       </w:r>
       <w:r>
         <w:rPr>
@@ -3529,7 +3569,7 @@
           <w:color w:val="1A1A1A"/>
           <w:sz w:val="21"/>
         </w:rPr>
-        <w:t>waives</w:t>
+        <w:t>Casting / Deciding Vote.</w:t>
       </w:r>
       <w:r>
         <w:rPr>
@@ -3539,7 +3579,27 @@
           <w:color w:val="1A1A1A"/>
           <w:sz w:val="21"/>
         </w:rPr>
-        <w:t xml:space="preserve"> any right of pre-emption, right of first refusal, tag-along, or similar right (whether arising under the CCL, the Company’s MOA or otherwise) to which it may be entitled in respect of the transfer of the Transfer Shares contemplated by this Agreement, and consents to such transfer.</w:t>
+        <w:t xml:space="preserve"> Where, in respect of any matter requiring the consent or decision of the shareholders of the Company, the view of the Transferor differs from that of either or both of the Transferees, the </w:t>
+      </w:r>
+      <w:r>
+        <w:rPr>
+          <w:rFonts w:ascii="Georgia" w:hAnsi="Georgia"/>
+          <w:b/>
+          <w:i w:val="0"/>
+          <w:color w:val="1A1A1A"/>
+          <w:sz w:val="21"/>
+        </w:rPr>
+        <w:t>view of the Transferor shall prevail and shall constitute the binding decision of the shareholders</w:t>
+      </w:r>
+      <w:r>
+        <w:rPr>
+          <w:rFonts w:ascii="Georgia" w:hAnsi="Georgia"/>
+          <w:b w:val="0"/>
+          <w:i w:val="0"/>
+          <w:color w:val="1A1A1A"/>
+          <w:sz w:val="21"/>
+        </w:rPr>
+        <w:t>. The Parties shall procure that the amended MOA expressly confers upon the Transferor a casting / deciding vote to give effect to this Clause.</w:t>
       </w:r>
     </w:p>
     <w:p>
@@ -3556,7 +3616,7 @@
           <w:color w:val="0E2A47"/>
           <w:sz w:val="21"/>
         </w:rPr>
-        <w:t>8.2</w:t>
+        <w:t>7.5</w:t>
       </w:r>
       <w:r>
         <w:rPr>
@@ -3576,43 +3636,26 @@
           <w:color w:val="1A1A1A"/>
           <w:sz w:val="21"/>
         </w:rPr>
-        <w:t>Each shareholder shall execute such waivers, consents and resolutions as may be required to confirm the foregoing for the purposes of notarisation and DET registration.</w:t>
-      </w:r>
-    </w:p>
-    <w:p>
-      <w:pPr>
-        <w:keepNext/>
-        <w:spacing w:before="280" w:after="80"/>
-      </w:pPr>
-      <w:r>
-        <w:rPr>
-          <w:rFonts w:ascii="Calibri" w:hAnsi="Calibri"/>
+      </w:r>
+      <w:r>
+        <w:rPr>
+          <w:rFonts w:ascii="Georgia" w:hAnsi="Georgia"/>
           <w:b/>
           <w:i w:val="0"/>
-          <w:color w:val="0E2A47"/>
-          <w:sz w:val="23"/>
-        </w:rPr>
-        <w:t>9.</w:t>
-      </w:r>
-      <w:r>
-        <w:rPr>
-          <w:rFonts w:ascii="Calibri" w:hAnsi="Calibri"/>
-          <w:b/>
-          <w:i w:val="0"/>
-          <w:color w:val="0E2A47"/>
-          <w:sz w:val="23"/>
-        </w:rPr>
-        <w:t xml:space="preserve">   </w:t>
-      </w:r>
-      <w:r>
-        <w:rPr>
-          <w:rFonts w:ascii="Calibri" w:hAnsi="Calibri"/>
-          <w:b/>
-          <w:i w:val="0"/>
-          <w:color w:val="0E2A47"/>
-          <w:sz w:val="23"/>
-        </w:rPr>
-        <w:t>REPRESENTATIONS AND WARRANTIES</w:t>
+          <w:color w:val="1A1A1A"/>
+          <w:sz w:val="21"/>
+        </w:rPr>
+        <w:t>Sole Right to Appoint the General Manager.</w:t>
+      </w:r>
+      <w:r>
+        <w:rPr>
+          <w:rFonts w:ascii="Georgia" w:hAnsi="Georgia"/>
+          <w:b w:val="0"/>
+          <w:i w:val="0"/>
+          <w:color w:val="1A1A1A"/>
+          <w:sz w:val="21"/>
+        </w:rPr>
+        <w:t xml:space="preserve"> The Transferor shall have the sole and exclusive right to nominate, appoint, re-appoint, remove and replace the General Manager (and any other manager, director or officer) of the Company, and to determine the terms of their appointment and remuneration. The Transferees shall vote in favour of, and shall not oppose, any such nomination, appointment, re-appointment, removal or replacement.</w:t>
       </w:r>
     </w:p>
     <w:p>
@@ -3629,7 +3672,7 @@
           <w:color w:val="0E2A47"/>
           <w:sz w:val="21"/>
         </w:rPr>
-        <w:t>9.1</w:t>
+        <w:t>7.6</w:t>
       </w:r>
       <w:r>
         <w:rPr>
@@ -3649,7 +3692,46 @@
           <w:color w:val="1A1A1A"/>
           <w:sz w:val="21"/>
         </w:rPr>
-        <w:t>Each Party represents and warrants to the others that: (a) it has the power and authority (and, where applicable, the requisite corporate authorisations) to enter into and perform this Agreement; (b) this Agreement constitutes its legal, valid and binding obligations; and (c) its entry into this Agreement does not breach any Applicable Law or any agreement binding upon it.</w:t>
+      </w:r>
+      <w:r>
+        <w:rPr>
+          <w:rFonts w:ascii="Georgia" w:hAnsi="Georgia"/>
+          <w:b/>
+          <w:i w:val="0"/>
+          <w:color w:val="1A1A1A"/>
+          <w:sz w:val="21"/>
+        </w:rPr>
+        <w:t>Reserved Matters.</w:t>
+      </w:r>
+      <w:r>
+        <w:rPr>
+          <w:rFonts w:ascii="Georgia" w:hAnsi="Georgia"/>
+          <w:b w:val="0"/>
+          <w:i w:val="0"/>
+          <w:color w:val="1A1A1A"/>
+          <w:sz w:val="21"/>
+        </w:rPr>
+        <w:t xml:space="preserve"> Without limiting the generality of the foregoing, none of the following matters may be approved, undertaken or implemented by the Company, by any shareholder or by any manager, director or officer of the Company without the </w:t>
+      </w:r>
+      <w:r>
+        <w:rPr>
+          <w:rFonts w:ascii="Georgia" w:hAnsi="Georgia"/>
+          <w:b/>
+          <w:i w:val="0"/>
+          <w:color w:val="1A1A1A"/>
+          <w:sz w:val="21"/>
+        </w:rPr>
+        <w:t>prior written consent of the Transferor</w:t>
+      </w:r>
+      <w:r>
+        <w:rPr>
+          <w:rFonts w:ascii="Georgia" w:hAnsi="Georgia"/>
+          <w:b w:val="0"/>
+          <w:i w:val="0"/>
+          <w:color w:val="1A1A1A"/>
+          <w:sz w:val="21"/>
+        </w:rPr>
+        <w:t xml:space="preserve"> (acting by the Founder): (a) any amendment to the MOA, articles or constitutional documents of the Company; (b) any increase, reduction, reorganisation or other change to the share capital of the Company; (c) the declaration or payment of any dividend or other distribution to shareholders; (d) the issuance, allotment, repurchase or redemption of any shares or other securities; (e) any merger, consolidation, demerger, liquidation, winding-up or dissolution of the Company; (f) any sale, lease, disposal or acquisition of assets or businesses outside the ordinary course of business; (g) any incurrence of borrowing, financial indebtedness, guarantee or surety, or the creation of any Encumbrance over the assets of the Company; (h) the entry into, amendment or termination of any related-party or affiliate transaction; (i) the approval of the annual budget, business plan and audited financial statements; (j) the appointment, removal or remuneration of the auditors and key management personnel; (k) the commencement, settlement or compromise of any litigation, arbitration or material claim; (l) any change to the nature, scope or location of the business activities of the Company; (m) the opening or closing of any bank account, or any change to authorised signatories thereto; and (n) any transfer, pledge or grant of any Encumbrance by a shareholder over its shares in the Company.</w:t>
       </w:r>
     </w:p>
     <w:p>
@@ -3666,7 +3748,7 @@
           <w:color w:val="0E2A47"/>
           <w:sz w:val="21"/>
         </w:rPr>
-        <w:t>9.2</w:t>
+        <w:t>7.7</w:t>
       </w:r>
       <w:r>
         <w:rPr>
@@ -3686,7 +3768,26 @@
           <w:color w:val="1A1A1A"/>
           <w:sz w:val="21"/>
         </w:rPr>
-        <w:t>The Transferor further represents and warrants that, as at the Effective Date, it is the legal and beneficial owner of 70% of the issued share capital of the Company, free from Encumbrances, and that the Transfer Shares will at Completion be transferred free from Encumbrances.</w:t>
+      </w:r>
+      <w:r>
+        <w:rPr>
+          <w:rFonts w:ascii="Georgia" w:hAnsi="Georgia"/>
+          <w:b/>
+          <w:i w:val="0"/>
+          <w:color w:val="1A1A1A"/>
+          <w:sz w:val="21"/>
+        </w:rPr>
+        <w:t>Entrenchment in the Memorandum of Association.</w:t>
+      </w:r>
+      <w:r>
+        <w:rPr>
+          <w:rFonts w:ascii="Georgia" w:hAnsi="Georgia"/>
+          <w:b w:val="0"/>
+          <w:i w:val="0"/>
+          <w:color w:val="1A1A1A"/>
+          <w:sz w:val="21"/>
+        </w:rPr>
+        <w:t xml:space="preserve"> The Parties shall procure that, at Completion, the Company’s MOA is amended (and notarised before the Notary Public and registered with the DET) so as to reflect and entrench the arrangements set out in this Clause 7, including (i) the Transferor’s casting / deciding vote; (ii) the Transferor’s sole right to appoint and remove the General Manager; and (iii) the requirement that the Reserved Matters require the prior written consent of the Transferor. Where, by Applicable Law, any such entrenchment must take the form of weighted voting rights, super-majority requirements or a dedicated class of shares, the Parties shall co-operate in good faith to give effect to the same in the manner most likely to be enforceable under UAE law.</w:t>
       </w:r>
     </w:p>
     <w:p>
@@ -3703,7 +3804,7 @@
           <w:color w:val="0E2A47"/>
           <w:sz w:val="21"/>
         </w:rPr>
-        <w:t>9.3</w:t>
+        <w:t>7.8</w:t>
       </w:r>
       <w:r>
         <w:rPr>
@@ -3723,43 +3824,26 @@
           <w:color w:val="1A1A1A"/>
           <w:sz w:val="21"/>
         </w:rPr>
-        <w:t>Each Transferee acknowledges that, save as expressly set out in this Agreement, no representation, warranty or assurance has been given as to the future profitability or value of the Company or the Transfer Shares.</w:t>
-      </w:r>
-    </w:p>
-    <w:p>
-      <w:pPr>
-        <w:keepNext/>
-        <w:spacing w:before="280" w:after="80"/>
-      </w:pPr>
-      <w:r>
-        <w:rPr>
-          <w:rFonts w:ascii="Calibri" w:hAnsi="Calibri"/>
+      </w:r>
+      <w:r>
+        <w:rPr>
+          <w:rFonts w:ascii="Georgia" w:hAnsi="Georgia"/>
           <w:b/>
           <w:i w:val="0"/>
-          <w:color w:val="0E2A47"/>
-          <w:sz w:val="23"/>
-        </w:rPr>
-        <w:t>10.</w:t>
-      </w:r>
-      <w:r>
-        <w:rPr>
-          <w:rFonts w:ascii="Calibri" w:hAnsi="Calibri"/>
-          <w:b/>
-          <w:i w:val="0"/>
-          <w:color w:val="0E2A47"/>
-          <w:sz w:val="23"/>
-        </w:rPr>
-        <w:t xml:space="preserve">   </w:t>
-      </w:r>
-      <w:r>
-        <w:rPr>
-          <w:rFonts w:ascii="Calibri" w:hAnsi="Calibri"/>
-          <w:b/>
-          <w:i w:val="0"/>
-          <w:color w:val="0E2A47"/>
-          <w:sz w:val="23"/>
-        </w:rPr>
-        <w:t>CONDUCT PENDING COMPLETION</w:t>
+          <w:color w:val="1A1A1A"/>
+          <w:sz w:val="21"/>
+        </w:rPr>
+        <w:t>No Variation Without Founder Consent.</w:t>
+      </w:r>
+      <w:r>
+        <w:rPr>
+          <w:rFonts w:ascii="Georgia" w:hAnsi="Georgia"/>
+          <w:b w:val="0"/>
+          <w:i w:val="0"/>
+          <w:color w:val="1A1A1A"/>
+          <w:sz w:val="21"/>
+        </w:rPr>
+        <w:t xml:space="preserve"> The arrangements in this Clause 7 are a fundamental condition of the transfer of the Transfer Shares and may not be varied, suspended or waived save with the prior written consent of the Transferor (acting by the Founder). Any purported variation or waiver in breach of this Clause shall be null and void.</w:t>
       </w:r>
     </w:p>
     <w:p>
@@ -3776,7 +3860,7 @@
           <w:color w:val="0E2A47"/>
           <w:sz w:val="21"/>
         </w:rPr>
-        <w:t>10.1</w:t>
+        <w:t>7.9</w:t>
       </w:r>
       <w:r>
         <w:rPr>
@@ -3796,7 +3880,26 @@
           <w:color w:val="1A1A1A"/>
           <w:sz w:val="21"/>
         </w:rPr>
-        <w:t>From the Effective Date until Completion or termination of this Agreement, the Transferor shall not create any Encumbrance over, or transfer to any third party, the Transfer Shares in a manner that would prevent it from performing its obligations under this Agreement, save with the prior written consent of the Founder.</w:t>
+      </w:r>
+      <w:r>
+        <w:rPr>
+          <w:rFonts w:ascii="Georgia" w:hAnsi="Georgia"/>
+          <w:b/>
+          <w:i w:val="0"/>
+          <w:color w:val="1A1A1A"/>
+          <w:sz w:val="21"/>
+        </w:rPr>
+        <w:t>Specific Performance.</w:t>
+      </w:r>
+      <w:r>
+        <w:rPr>
+          <w:rFonts w:ascii="Georgia" w:hAnsi="Georgia"/>
+          <w:b w:val="0"/>
+          <w:i w:val="0"/>
+          <w:color w:val="1A1A1A"/>
+          <w:sz w:val="21"/>
+        </w:rPr>
+        <w:t xml:space="preserve"> The Parties acknowledge that damages would not be an adequate remedy for any breach of this Clause 7 and that the Transferor shall be entitled to seek specific performance, injunctive relief and any other equitable remedy available under Applicable Law.</w:t>
       </w:r>
     </w:p>
     <w:p>
@@ -3813,7 +3916,7 @@
           <w:color w:val="0E2A47"/>
           <w:sz w:val="21"/>
         </w:rPr>
-        <w:t>10.2</w:t>
+        <w:t>7.10</w:t>
       </w:r>
       <w:r>
         <w:rPr>
@@ -3833,7 +3936,26 @@
           <w:color w:val="1A1A1A"/>
           <w:sz w:val="21"/>
         </w:rPr>
-        <w:t>Nothing in this Clause restricts the ordinary conduct of the business of the Company or the exercise by the Transferor of its rights as a 70% shareholder.</w:t>
+      </w:r>
+      <w:r>
+        <w:rPr>
+          <w:rFonts w:ascii="Georgia" w:hAnsi="Georgia"/>
+          <w:b/>
+          <w:i w:val="0"/>
+          <w:color w:val="1A1A1A"/>
+          <w:sz w:val="21"/>
+        </w:rPr>
+        <w:t>Survival.</w:t>
+      </w:r>
+      <w:r>
+        <w:rPr>
+          <w:rFonts w:ascii="Georgia" w:hAnsi="Georgia"/>
+          <w:b w:val="0"/>
+          <w:i w:val="0"/>
+          <w:color w:val="1A1A1A"/>
+          <w:sz w:val="21"/>
+        </w:rPr>
+        <w:t xml:space="preserve"> This Clause 7 shall take effect from Completion and shall continue in force for so long as the Transferor holds any shares in the Company.</w:t>
       </w:r>
     </w:p>
     <w:p>
@@ -3849,7 +3971,7 @@
           <w:color w:val="0E2A47"/>
           <w:sz w:val="23"/>
         </w:rPr>
-        <w:t>11.</w:t>
+        <w:t>8.</w:t>
       </w:r>
       <w:r>
         <w:rPr>
@@ -3869,7 +3991,7 @@
           <w:color w:val="0E2A47"/>
           <w:sz w:val="23"/>
         </w:rPr>
-        <w:t>CONFIDENTIALITY</w:t>
+        <w:t>CONSIDERATION</w:t>
       </w:r>
     </w:p>
     <w:p>
@@ -3886,7 +4008,7 @@
           <w:color w:val="0E2A47"/>
           <w:sz w:val="21"/>
         </w:rPr>
-        <w:t>11.1</w:t>
+        <w:t>8.1</w:t>
       </w:r>
       <w:r>
         <w:rPr>
@@ -3906,43 +4028,27 @@
           <w:color w:val="1A1A1A"/>
           <w:sz w:val="21"/>
         </w:rPr>
-        <w:t>Each Party shall keep confidential the terms of this Agreement and all information concerning the other Parties and the Company obtained in connection with it, and shall not disclose the same save: (a) as required by Applicable Law, a court or regulator (including the DET and the Notary Public); (b) to its professional advisers under a duty of confidence; or (c) with the prior written consent of the other Parties.</w:t>
-      </w:r>
-    </w:p>
-    <w:p>
-      <w:pPr>
-        <w:keepNext/>
-        <w:spacing w:before="280" w:after="80"/>
-      </w:pPr>
-      <w:r>
-        <w:rPr>
-          <w:rFonts w:ascii="Calibri" w:hAnsi="Calibri"/>
+        <w:t xml:space="preserve">In consideration of the achievement of the Performance Threshold and the past and continuing performance and services of the Transferees, the Transfer Shares shall be transferred to the Transferees for an </w:t>
+      </w:r>
+      <w:r>
+        <w:rPr>
+          <w:rFonts w:ascii="Georgia" w:hAnsi="Georgia"/>
           <w:b/>
           <w:i w:val="0"/>
-          <w:color w:val="0E2A47"/>
-          <w:sz w:val="23"/>
-        </w:rPr>
-        <w:t>12.</w:t>
-      </w:r>
-      <w:r>
-        <w:rPr>
-          <w:rFonts w:ascii="Calibri" w:hAnsi="Calibri"/>
-          <w:b/>
-          <w:i w:val="0"/>
-          <w:color w:val="0E2A47"/>
-          <w:sz w:val="23"/>
-        </w:rPr>
-        <w:t xml:space="preserve">   </w:t>
-      </w:r>
-      <w:r>
-        <w:rPr>
-          <w:rFonts w:ascii="Calibri" w:hAnsi="Calibri"/>
-          <w:b/>
-          <w:i w:val="0"/>
-          <w:color w:val="0E2A47"/>
-          <w:sz w:val="23"/>
-        </w:rPr>
-        <w:t>COSTS, FEES AND TAXES</w:t>
+          <w:color w:val="1A1A1A"/>
+          <w:sz w:val="21"/>
+        </w:rPr>
+        <w:t>aggregate nominal consideration of AED 1.00 (one UAE Dirham)</w:t>
+      </w:r>
+      <w:r>
+        <w:rPr>
+          <w:rFonts w:ascii="Georgia" w:hAnsi="Georgia"/>
+          <w:b w:val="0"/>
+          <w:i w:val="0"/>
+          <w:color w:val="1A1A1A"/>
+          <w:sz w:val="21"/>
+        </w:rPr>
+        <w:t xml:space="preserve"> (or such nominal/par amount as the Notary Public may require to be stated), the receipt and adequacy of which the Transferor acknowledges.</w:t>
       </w:r>
     </w:p>
     <w:p>
@@ -3959,7 +4065,7 @@
           <w:color w:val="0E2A47"/>
           <w:sz w:val="21"/>
         </w:rPr>
-        <w:t>12.1</w:t>
+        <w:t>8.2</w:t>
       </w:r>
       <w:r>
         <w:rPr>
@@ -3979,7 +4085,27 @@
           <w:color w:val="1A1A1A"/>
           <w:sz w:val="21"/>
         </w:rPr>
-        <w:t>Save as otherwise agreed in writing, the Transferor shall bear the Notary Public fees, DET amendment fees and registration costs directly arising from Completion, and each Party shall bear its own legal and advisory costs.</w:t>
+        <w:t xml:space="preserve">The Parties confirm that the transfer is by way of a </w:t>
+      </w:r>
+      <w:r>
+        <w:rPr>
+          <w:rFonts w:ascii="Georgia" w:hAnsi="Georgia"/>
+          <w:b/>
+          <w:i w:val="0"/>
+          <w:color w:val="1A1A1A"/>
+          <w:sz w:val="21"/>
+        </w:rPr>
+        <w:t>performance reward and incentive</w:t>
+      </w:r>
+      <w:r>
+        <w:rPr>
+          <w:rFonts w:ascii="Georgia" w:hAnsi="Georgia"/>
+          <w:b w:val="0"/>
+          <w:i w:val="0"/>
+          <w:color w:val="1A1A1A"/>
+          <w:sz w:val="21"/>
+        </w:rPr>
+        <w:t xml:space="preserve"> and is not a sale at market value. Each Party shall bear its own tax position arising from the transfer and shall be responsible for obtaining its own independent tax advice (including in relation to UAE Corporate Tax and any applicable VAT).</w:t>
       </w:r>
     </w:p>
     <w:p>
@@ -3996,7 +4122,7 @@
           <w:color w:val="0E2A47"/>
           <w:sz w:val="21"/>
         </w:rPr>
-        <w:t>12.2</w:t>
+        <w:t>8.3</w:t>
       </w:r>
       <w:r>
         <w:rPr>
@@ -4016,7 +4142,7 @@
           <w:color w:val="1A1A1A"/>
           <w:sz w:val="21"/>
         </w:rPr>
-        <w:t>Each Party shall be responsible for its own taxes (if any) arising from the transfer of the Transfer Shares.</w:t>
+        <w:t>Nothing in this Clause 8 limits the Founder’s discretion under Clause 5 or the rights reserved to the Transferor under Clause 7, nor obliges the Transferor to transfer the Transfer Shares otherwise than in accordance with this Agreement.</w:t>
       </w:r>
     </w:p>
     <w:p>
@@ -4032,7 +4158,7 @@
           <w:color w:val="0E2A47"/>
           <w:sz w:val="23"/>
         </w:rPr>
-        <w:t>13.</w:t>
+        <w:t>9.</w:t>
       </w:r>
       <w:r>
         <w:rPr>
@@ -4052,7 +4178,7 @@
           <w:color w:val="0E2A47"/>
           <w:sz w:val="23"/>
         </w:rPr>
-        <w:t>TERM AND TERMINATION</w:t>
+        <w:t>WAIVER OF PRE-EMPTION RIGHTS</w:t>
       </w:r>
     </w:p>
     <w:p>
@@ -4069,7 +4195,7 @@
           <w:color w:val="0E2A47"/>
           <w:sz w:val="21"/>
         </w:rPr>
-        <w:t>13.1</w:t>
+        <w:t>9.1</w:t>
       </w:r>
       <w:r>
         <w:rPr>
@@ -4089,7 +4215,27 @@
           <w:color w:val="1A1A1A"/>
           <w:sz w:val="21"/>
         </w:rPr>
-        <w:t>This Agreement takes effect on the Effective Date and continues until the earlier of (a) Completion and (b) termination in accordance with this Clause 13.</w:t>
+        <w:t xml:space="preserve">Each shareholder of the Company (including the Transferees) irrevocably and unconditionally </w:t>
+      </w:r>
+      <w:r>
+        <w:rPr>
+          <w:rFonts w:ascii="Georgia" w:hAnsi="Georgia"/>
+          <w:b/>
+          <w:i w:val="0"/>
+          <w:color w:val="1A1A1A"/>
+          <w:sz w:val="21"/>
+        </w:rPr>
+        <w:t>waives</w:t>
+      </w:r>
+      <w:r>
+        <w:rPr>
+          <w:rFonts w:ascii="Georgia" w:hAnsi="Georgia"/>
+          <w:b w:val="0"/>
+          <w:i w:val="0"/>
+          <w:color w:val="1A1A1A"/>
+          <w:sz w:val="21"/>
+        </w:rPr>
+        <w:t xml:space="preserve"> any right of pre-emption, right of first refusal, tag-along, or similar right (whether arising under the CCL, the Company’s MOA or otherwise) to which it may be entitled in respect of the transfer of the Transfer Shares contemplated by this Agreement, and consents to such transfer.</w:t>
       </w:r>
     </w:p>
     <w:p>
@@ -4106,7 +4252,7 @@
           <w:color w:val="0E2A47"/>
           <w:sz w:val="21"/>
         </w:rPr>
-        <w:t>13.2</w:t>
+        <w:t>9.2</w:t>
       </w:r>
       <w:r>
         <w:rPr>
@@ -4126,7 +4272,43 @@
           <w:color w:val="1A1A1A"/>
           <w:sz w:val="21"/>
         </w:rPr>
-        <w:t>This Agreement may be terminated by the written agreement of the Transferor and the Company, or by the Transferor (acting by the Founder) if the Performance Threshold has not been achieved and the Transferor reasonably determines that it is no longer capable of being achieved, in each case without liability save in respect of antecedent breaches.</w:t>
+        <w:t>Each shareholder shall execute such waivers, consents and resolutions as may be required to confirm the foregoing for the purposes of notarisation and DET registration.</w:t>
+      </w:r>
+    </w:p>
+    <w:p>
+      <w:pPr>
+        <w:keepNext/>
+        <w:spacing w:before="280" w:after="80"/>
+      </w:pPr>
+      <w:r>
+        <w:rPr>
+          <w:rFonts w:ascii="Calibri" w:hAnsi="Calibri"/>
+          <w:b/>
+          <w:i w:val="0"/>
+          <w:color w:val="0E2A47"/>
+          <w:sz w:val="23"/>
+        </w:rPr>
+        <w:t>10.</w:t>
+      </w:r>
+      <w:r>
+        <w:rPr>
+          <w:rFonts w:ascii="Calibri" w:hAnsi="Calibri"/>
+          <w:b/>
+          <w:i w:val="0"/>
+          <w:color w:val="0E2A47"/>
+          <w:sz w:val="23"/>
+        </w:rPr>
+        <w:t xml:space="preserve">   </w:t>
+      </w:r>
+      <w:r>
+        <w:rPr>
+          <w:rFonts w:ascii="Calibri" w:hAnsi="Calibri"/>
+          <w:b/>
+          <w:i w:val="0"/>
+          <w:color w:val="0E2A47"/>
+          <w:sz w:val="23"/>
+        </w:rPr>
+        <w:t>REPRESENTATIONS AND WARRANTIES</w:t>
       </w:r>
     </w:p>
     <w:p>
@@ -4143,7 +4325,7 @@
           <w:color w:val="0E2A47"/>
           <w:sz w:val="21"/>
         </w:rPr>
-        <w:t>13.3</w:t>
+        <w:t>10.1</w:t>
       </w:r>
       <w:r>
         <w:rPr>
@@ -4163,43 +4345,7 @@
           <w:color w:val="1A1A1A"/>
           <w:sz w:val="21"/>
         </w:rPr>
-        <w:t>Clauses 1, 11, 14 and 15 survive termination.</w:t>
-      </w:r>
-    </w:p>
-    <w:p>
-      <w:pPr>
-        <w:keepNext/>
-        <w:spacing w:before="280" w:after="80"/>
-      </w:pPr>
-      <w:r>
-        <w:rPr>
-          <w:rFonts w:ascii="Calibri" w:hAnsi="Calibri"/>
-          <w:b/>
-          <w:i w:val="0"/>
-          <w:color w:val="0E2A47"/>
-          <w:sz w:val="23"/>
-        </w:rPr>
-        <w:t>14.</w:t>
-      </w:r>
-      <w:r>
-        <w:rPr>
-          <w:rFonts w:ascii="Calibri" w:hAnsi="Calibri"/>
-          <w:b/>
-          <w:i w:val="0"/>
-          <w:color w:val="0E2A47"/>
-          <w:sz w:val="23"/>
-        </w:rPr>
-        <w:t xml:space="preserve">   </w:t>
-      </w:r>
-      <w:r>
-        <w:rPr>
-          <w:rFonts w:ascii="Calibri" w:hAnsi="Calibri"/>
-          <w:b/>
-          <w:i w:val="0"/>
-          <w:color w:val="0E2A47"/>
-          <w:sz w:val="23"/>
-        </w:rPr>
-        <w:t>GOVERNING LAW AND JURISDICTION</w:t>
+        <w:t>Each Party represents and warrants to the others that: (a) it has the power and authority (and, where applicable, the requisite corporate authorisations) to enter into and perform this Agreement; (b) this Agreement constitutes its legal, valid and binding obligations; and (c) its entry into this Agreement does not breach any Applicable Law or any agreement binding upon it.</w:t>
       </w:r>
     </w:p>
     <w:p>
@@ -4216,7 +4362,7 @@
           <w:color w:val="0E2A47"/>
           <w:sz w:val="21"/>
         </w:rPr>
-        <w:t>14.1</w:t>
+        <w:t>10.2</w:t>
       </w:r>
       <w:r>
         <w:rPr>
@@ -4236,27 +4382,7 @@
           <w:color w:val="1A1A1A"/>
           <w:sz w:val="21"/>
         </w:rPr>
-        <w:t xml:space="preserve">This Agreement and any non-contractual obligations arising out of or in connection with it are governed by, and shall be construed in accordance with, the </w:t>
-      </w:r>
-      <w:r>
-        <w:rPr>
-          <w:rFonts w:ascii="Georgia" w:hAnsi="Georgia"/>
-          <w:b/>
-          <w:i w:val="0"/>
-          <w:color w:val="1A1A1A"/>
-          <w:sz w:val="21"/>
-        </w:rPr>
-        <w:t>federal laws of the United Arab Emirates as applied in the Emirate of Dubai</w:t>
-      </w:r>
-      <w:r>
-        <w:rPr>
-          <w:rFonts w:ascii="Georgia" w:hAnsi="Georgia"/>
-          <w:b w:val="0"/>
-          <w:i w:val="0"/>
-          <w:color w:val="1A1A1A"/>
-          <w:sz w:val="21"/>
-        </w:rPr>
-        <w:t>.</w:t>
+        <w:t>The Transferor further represents and warrants that, as at the Effective Date, it is the legal and beneficial owner of 70% of the issued share capital of the Company, free from Encumbrances, and that the Transfer Shares will at Completion be transferred free from Encumbrances.</w:t>
       </w:r>
     </w:p>
     <w:p>
@@ -4273,7 +4399,7 @@
           <w:color w:val="0E2A47"/>
           <w:sz w:val="21"/>
         </w:rPr>
-        <w:t>14.2</w:t>
+        <w:t>10.3</w:t>
       </w:r>
       <w:r>
         <w:rPr>
@@ -4293,27 +4419,43 @@
           <w:color w:val="1A1A1A"/>
           <w:sz w:val="21"/>
         </w:rPr>
-        <w:t xml:space="preserve">The Parties irrevocably submit to the </w:t>
-      </w:r>
-      <w:r>
-        <w:rPr>
-          <w:rFonts w:ascii="Georgia" w:hAnsi="Georgia"/>
+        <w:t>Each Transferee acknowledges that, save as expressly set out in this Agreement, no representation, warranty or assurance has been given as to the future profitability or value of the Company or the Transfer Shares.</w:t>
+      </w:r>
+    </w:p>
+    <w:p>
+      <w:pPr>
+        <w:keepNext/>
+        <w:spacing w:before="280" w:after="80"/>
+      </w:pPr>
+      <w:r>
+        <w:rPr>
+          <w:rFonts w:ascii="Calibri" w:hAnsi="Calibri"/>
           <w:b/>
           <w:i w:val="0"/>
-          <w:color w:val="1A1A1A"/>
-          <w:sz w:val="21"/>
-        </w:rPr>
-        <w:t>exclusive jurisdiction of the Courts of Dubai</w:t>
-      </w:r>
-      <w:r>
-        <w:rPr>
-          <w:rFonts w:ascii="Georgia" w:hAnsi="Georgia"/>
-          <w:b w:val="0"/>
-          <w:i w:val="0"/>
-          <w:color w:val="1A1A1A"/>
-          <w:sz w:val="21"/>
-        </w:rPr>
-        <w:t xml:space="preserve"> in respect of any dispute arising out of or in connection with this Agreement, without prejudice to any mandatory requirement for notarisation or registration before the Notary Public and the DET.</w:t>
+          <w:color w:val="0E2A47"/>
+          <w:sz w:val="23"/>
+        </w:rPr>
+        <w:t>11.</w:t>
+      </w:r>
+      <w:r>
+        <w:rPr>
+          <w:rFonts w:ascii="Calibri" w:hAnsi="Calibri"/>
+          <w:b/>
+          <w:i w:val="0"/>
+          <w:color w:val="0E2A47"/>
+          <w:sz w:val="23"/>
+        </w:rPr>
+        <w:t xml:space="preserve">   </w:t>
+      </w:r>
+      <w:r>
+        <w:rPr>
+          <w:rFonts w:ascii="Calibri" w:hAnsi="Calibri"/>
+          <w:b/>
+          <w:i w:val="0"/>
+          <w:color w:val="0E2A47"/>
+          <w:sz w:val="23"/>
+        </w:rPr>
+        <w:t>CONDUCT PENDING COMPLETION</w:t>
       </w:r>
     </w:p>
     <w:p>
@@ -4330,7 +4472,7 @@
           <w:color w:val="0E2A47"/>
           <w:sz w:val="21"/>
         </w:rPr>
-        <w:t>14.3</w:t>
+        <w:t>11.1</w:t>
       </w:r>
       <w:r>
         <w:rPr>
@@ -4350,63 +4492,7 @@
           <w:color w:val="1A1A1A"/>
           <w:sz w:val="21"/>
         </w:rPr>
-        <w:t xml:space="preserve">The Parties may, by written agreement, elect to refer any dispute instead to arbitration administered by the </w:t>
-      </w:r>
-      <w:r>
-        <w:rPr>
-          <w:rFonts w:ascii="Georgia" w:hAnsi="Georgia"/>
-          <w:b/>
-          <w:i w:val="0"/>
-          <w:color w:val="1A1A1A"/>
-          <w:sz w:val="21"/>
-        </w:rPr>
-        <w:t>Dubai International Arbitration Centre (DIAC)</w:t>
-      </w:r>
-      <w:r>
-        <w:rPr>
-          <w:rFonts w:ascii="Georgia" w:hAnsi="Georgia"/>
-          <w:b w:val="0"/>
-          <w:i w:val="0"/>
-          <w:color w:val="1A1A1A"/>
-          <w:sz w:val="21"/>
-        </w:rPr>
-        <w:t>, seated in Dubai and conducted in the English language.</w:t>
-      </w:r>
-    </w:p>
-    <w:p>
-      <w:pPr>
-        <w:keepNext/>
-        <w:spacing w:before="280" w:after="80"/>
-      </w:pPr>
-      <w:r>
-        <w:rPr>
-          <w:rFonts w:ascii="Calibri" w:hAnsi="Calibri"/>
-          <w:b/>
-          <w:i w:val="0"/>
-          <w:color w:val="0E2A47"/>
-          <w:sz w:val="23"/>
-        </w:rPr>
-        <w:t>15.</w:t>
-      </w:r>
-      <w:r>
-        <w:rPr>
-          <w:rFonts w:ascii="Calibri" w:hAnsi="Calibri"/>
-          <w:b/>
-          <w:i w:val="0"/>
-          <w:color w:val="0E2A47"/>
-          <w:sz w:val="23"/>
-        </w:rPr>
-        <w:t xml:space="preserve">   </w:t>
-      </w:r>
-      <w:r>
-        <w:rPr>
-          <w:rFonts w:ascii="Calibri" w:hAnsi="Calibri"/>
-          <w:b/>
-          <w:i w:val="0"/>
-          <w:color w:val="0E2A47"/>
-          <w:sz w:val="23"/>
-        </w:rPr>
-        <w:t>GENERAL PROVISIONS</w:t>
+        <w:t>From the Effective Date until Completion or termination of this Agreement, the Transferor shall not create any Encumbrance over, or transfer to any third party, the Transfer Shares in a manner that would prevent it from performing its obligations under this Agreement, save with the prior written consent of the Founder.</w:t>
       </w:r>
     </w:p>
     <w:p>
@@ -4423,7 +4509,7 @@
           <w:color w:val="0E2A47"/>
           <w:sz w:val="21"/>
         </w:rPr>
-        <w:t>15.1</w:t>
+        <w:t>11.2</w:t>
       </w:r>
       <w:r>
         <w:rPr>
@@ -4443,26 +4529,43 @@
           <w:color w:val="1A1A1A"/>
           <w:sz w:val="21"/>
         </w:rPr>
-      </w:r>
-      <w:r>
-        <w:rPr>
-          <w:rFonts w:ascii="Georgia" w:hAnsi="Georgia"/>
+        <w:t>Nothing in this Clause restricts the ordinary conduct of the business of the Company or the exercise by the Transferor of its rights as a 70% shareholder.</w:t>
+      </w:r>
+    </w:p>
+    <w:p>
+      <w:pPr>
+        <w:keepNext/>
+        <w:spacing w:before="280" w:after="80"/>
+      </w:pPr>
+      <w:r>
+        <w:rPr>
+          <w:rFonts w:ascii="Calibri" w:hAnsi="Calibri"/>
           <w:b/>
           <w:i w:val="0"/>
-          <w:color w:val="1A1A1A"/>
-          <w:sz w:val="21"/>
-        </w:rPr>
-        <w:t>Entire Agreement.</w:t>
-      </w:r>
-      <w:r>
-        <w:rPr>
-          <w:rFonts w:ascii="Georgia" w:hAnsi="Georgia"/>
-          <w:b w:val="0"/>
-          <w:i w:val="0"/>
-          <w:color w:val="1A1A1A"/>
-          <w:sz w:val="21"/>
-        </w:rPr>
-        <w:t xml:space="preserve"> This Agreement constitutes the entire agreement between the Parties in relation to its subject matter and supersedes all prior arrangements and understandings.</w:t>
+          <w:color w:val="0E2A47"/>
+          <w:sz w:val="23"/>
+        </w:rPr>
+        <w:t>12.</w:t>
+      </w:r>
+      <w:r>
+        <w:rPr>
+          <w:rFonts w:ascii="Calibri" w:hAnsi="Calibri"/>
+          <w:b/>
+          <w:i w:val="0"/>
+          <w:color w:val="0E2A47"/>
+          <w:sz w:val="23"/>
+        </w:rPr>
+        <w:t xml:space="preserve">   </w:t>
+      </w:r>
+      <w:r>
+        <w:rPr>
+          <w:rFonts w:ascii="Calibri" w:hAnsi="Calibri"/>
+          <w:b/>
+          <w:i w:val="0"/>
+          <w:color w:val="0E2A47"/>
+          <w:sz w:val="23"/>
+        </w:rPr>
+        <w:t>CONFIDENTIALITY</w:t>
       </w:r>
     </w:p>
     <w:p>
@@ -4479,7 +4582,7 @@
           <w:color w:val="0E2A47"/>
           <w:sz w:val="21"/>
         </w:rPr>
-        <w:t>15.2</w:t>
+        <w:t>12.1</w:t>
       </w:r>
       <w:r>
         <w:rPr>
@@ -4499,26 +4602,43 @@
           <w:color w:val="1A1A1A"/>
           <w:sz w:val="21"/>
         </w:rPr>
-      </w:r>
-      <w:r>
-        <w:rPr>
-          <w:rFonts w:ascii="Georgia" w:hAnsi="Georgia"/>
+        <w:t>Each Party shall keep confidential the terms of this Agreement and all information concerning the other Parties and the Company obtained in connection with it, and shall not disclose the same save: (a) as required by Applicable Law, a court or regulator (including the DET and the Notary Public); (b) to its professional advisers under a duty of confidence; or (c) with the prior written consent of the other Parties.</w:t>
+      </w:r>
+    </w:p>
+    <w:p>
+      <w:pPr>
+        <w:keepNext/>
+        <w:spacing w:before="280" w:after="80"/>
+      </w:pPr>
+      <w:r>
+        <w:rPr>
+          <w:rFonts w:ascii="Calibri" w:hAnsi="Calibri"/>
           <w:b/>
           <w:i w:val="0"/>
-          <w:color w:val="1A1A1A"/>
-          <w:sz w:val="21"/>
-        </w:rPr>
-        <w:t>Amendments.</w:t>
-      </w:r>
-      <w:r>
-        <w:rPr>
-          <w:rFonts w:ascii="Georgia" w:hAnsi="Georgia"/>
-          <w:b w:val="0"/>
-          <w:i w:val="0"/>
-          <w:color w:val="1A1A1A"/>
-          <w:sz w:val="21"/>
-        </w:rPr>
-        <w:t xml:space="preserve"> No amendment to this Agreement is effective unless in writing and signed by or on behalf of each Party.</w:t>
+          <w:color w:val="0E2A47"/>
+          <w:sz w:val="23"/>
+        </w:rPr>
+        <w:t>13.</w:t>
+      </w:r>
+      <w:r>
+        <w:rPr>
+          <w:rFonts w:ascii="Calibri" w:hAnsi="Calibri"/>
+          <w:b/>
+          <w:i w:val="0"/>
+          <w:color w:val="0E2A47"/>
+          <w:sz w:val="23"/>
+        </w:rPr>
+        <w:t xml:space="preserve">   </w:t>
+      </w:r>
+      <w:r>
+        <w:rPr>
+          <w:rFonts w:ascii="Calibri" w:hAnsi="Calibri"/>
+          <w:b/>
+          <w:i w:val="0"/>
+          <w:color w:val="0E2A47"/>
+          <w:sz w:val="23"/>
+        </w:rPr>
+        <w:t>COSTS, FEES AND TAXES</w:t>
       </w:r>
     </w:p>
     <w:p>
@@ -4535,7 +4655,7 @@
           <w:color w:val="0E2A47"/>
           <w:sz w:val="21"/>
         </w:rPr>
-        <w:t>15.3</w:t>
+        <w:t>13.1</w:t>
       </w:r>
       <w:r>
         <w:rPr>
@@ -4555,26 +4675,7 @@
           <w:color w:val="1A1A1A"/>
           <w:sz w:val="21"/>
         </w:rPr>
-      </w:r>
-      <w:r>
-        <w:rPr>
-          <w:rFonts w:ascii="Georgia" w:hAnsi="Georgia"/>
-          <w:b/>
-          <w:i w:val="0"/>
-          <w:color w:val="1A1A1A"/>
-          <w:sz w:val="21"/>
-        </w:rPr>
-        <w:t>No Waiver.</w:t>
-      </w:r>
-      <w:r>
-        <w:rPr>
-          <w:rFonts w:ascii="Georgia" w:hAnsi="Georgia"/>
-          <w:b w:val="0"/>
-          <w:i w:val="0"/>
-          <w:color w:val="1A1A1A"/>
-          <w:sz w:val="21"/>
-        </w:rPr>
-        <w:t xml:space="preserve"> No failure or delay in exercising any right operates as a waiver of it.</w:t>
+        <w:t>Save as otherwise agreed in writing, the Transferor shall bear the Notary Public fees, DET amendment fees and registration costs directly arising from Completion, and each Party shall bear its own legal and advisory costs.</w:t>
       </w:r>
     </w:p>
     <w:p>
@@ -4591,7 +4692,7 @@
           <w:color w:val="0E2A47"/>
           <w:sz w:val="21"/>
         </w:rPr>
-        <w:t>15.4</w:t>
+        <w:t>13.2</w:t>
       </w:r>
       <w:r>
         <w:rPr>
@@ -4611,26 +4712,43 @@
           <w:color w:val="1A1A1A"/>
           <w:sz w:val="21"/>
         </w:rPr>
-      </w:r>
-      <w:r>
-        <w:rPr>
-          <w:rFonts w:ascii="Georgia" w:hAnsi="Georgia"/>
+        <w:t>Each Party shall be responsible for its own taxes (if any) arising from the transfer of the Transfer Shares.</w:t>
+      </w:r>
+    </w:p>
+    <w:p>
+      <w:pPr>
+        <w:keepNext/>
+        <w:spacing w:before="280" w:after="80"/>
+      </w:pPr>
+      <w:r>
+        <w:rPr>
+          <w:rFonts w:ascii="Calibri" w:hAnsi="Calibri"/>
           <w:b/>
           <w:i w:val="0"/>
-          <w:color w:val="1A1A1A"/>
-          <w:sz w:val="21"/>
-        </w:rPr>
-        <w:t>Severability.</w:t>
-      </w:r>
-      <w:r>
-        <w:rPr>
-          <w:rFonts w:ascii="Georgia" w:hAnsi="Georgia"/>
-          <w:b w:val="0"/>
-          <w:i w:val="0"/>
-          <w:color w:val="1A1A1A"/>
-          <w:sz w:val="21"/>
-        </w:rPr>
-        <w:t xml:space="preserve"> If any provision is or becomes invalid or unenforceable, the remaining provisions continue in full force and the Parties shall negotiate in good faith to replace the invalid provision with a valid one of similar effect.</w:t>
+          <w:color w:val="0E2A47"/>
+          <w:sz w:val="23"/>
+        </w:rPr>
+        <w:t>14.</w:t>
+      </w:r>
+      <w:r>
+        <w:rPr>
+          <w:rFonts w:ascii="Calibri" w:hAnsi="Calibri"/>
+          <w:b/>
+          <w:i w:val="0"/>
+          <w:color w:val="0E2A47"/>
+          <w:sz w:val="23"/>
+        </w:rPr>
+        <w:t xml:space="preserve">   </w:t>
+      </w:r>
+      <w:r>
+        <w:rPr>
+          <w:rFonts w:ascii="Calibri" w:hAnsi="Calibri"/>
+          <w:b/>
+          <w:i w:val="0"/>
+          <w:color w:val="0E2A47"/>
+          <w:sz w:val="23"/>
+        </w:rPr>
+        <w:t>TERM AND TERMINATION</w:t>
       </w:r>
     </w:p>
     <w:p>
@@ -4647,7 +4765,7 @@
           <w:color w:val="0E2A47"/>
           <w:sz w:val="21"/>
         </w:rPr>
-        <w:t>15.5</w:t>
+        <w:t>14.1</w:t>
       </w:r>
       <w:r>
         <w:rPr>
@@ -4667,26 +4785,7 @@
           <w:color w:val="1A1A1A"/>
           <w:sz w:val="21"/>
         </w:rPr>
-      </w:r>
-      <w:r>
-        <w:rPr>
-          <w:rFonts w:ascii="Georgia" w:hAnsi="Georgia"/>
-          <w:b/>
-          <w:i w:val="0"/>
-          <w:color w:val="1A1A1A"/>
-          <w:sz w:val="21"/>
-        </w:rPr>
-        <w:t>Assignment.</w:t>
-      </w:r>
-      <w:r>
-        <w:rPr>
-          <w:rFonts w:ascii="Georgia" w:hAnsi="Georgia"/>
-          <w:b w:val="0"/>
-          <w:i w:val="0"/>
-          <w:color w:val="1A1A1A"/>
-          <w:sz w:val="21"/>
-        </w:rPr>
-        <w:t xml:space="preserve"> No Party may assign or transfer its rights or obligations under this Agreement without the prior written consent of the Transferor (acting by the Founder).</w:t>
+        <w:t>This Agreement takes effect on the Effective Date and continues until the earlier of (a) Completion and (b) termination in accordance with this Clause 14. The rights and obligations of the Transferor under Clause 7 shall, however, take effect from Completion and continue notwithstanding any termination thereafter, for so long as the Transferor holds any shares in the Company.</w:t>
       </w:r>
     </w:p>
     <w:p>
@@ -4703,7 +4802,7 @@
           <w:color w:val="0E2A47"/>
           <w:sz w:val="21"/>
         </w:rPr>
-        <w:t>15.6</w:t>
+        <w:t>14.2</w:t>
       </w:r>
       <w:r>
         <w:rPr>
@@ -4723,26 +4822,7 @@
           <w:color w:val="1A1A1A"/>
           <w:sz w:val="21"/>
         </w:rPr>
-      </w:r>
-      <w:r>
-        <w:rPr>
-          <w:rFonts w:ascii="Georgia" w:hAnsi="Georgia"/>
-          <w:b/>
-          <w:i w:val="0"/>
-          <w:color w:val="1A1A1A"/>
-          <w:sz w:val="21"/>
-        </w:rPr>
-        <w:t>Further Assurance.</w:t>
-      </w:r>
-      <w:r>
-        <w:rPr>
-          <w:rFonts w:ascii="Georgia" w:hAnsi="Georgia"/>
-          <w:b w:val="0"/>
-          <w:i w:val="0"/>
-          <w:color w:val="1A1A1A"/>
-          <w:sz w:val="21"/>
-        </w:rPr>
-        <w:t xml:space="preserve"> Each Party shall execute such further documents and do such further acts as may reasonably be required to give full effect to this Agreement.</w:t>
+        <w:t>This Agreement may be terminated by the written agreement of the Transferor and the Company, or by the Transferor (acting by the Founder) if the Performance Threshold has not been achieved and the Transferor reasonably determines that it is no longer capable of being achieved, in each case without liability save in respect of antecedent breaches.</w:t>
       </w:r>
     </w:p>
     <w:p>
@@ -4759,7 +4839,7 @@
           <w:color w:val="0E2A47"/>
           <w:sz w:val="21"/>
         </w:rPr>
-        <w:t>15.7</w:t>
+        <w:t>14.3</w:t>
       </w:r>
       <w:r>
         <w:rPr>
@@ -4779,26 +4859,43 @@
           <w:color w:val="1A1A1A"/>
           <w:sz w:val="21"/>
         </w:rPr>
-      </w:r>
-      <w:r>
-        <w:rPr>
-          <w:rFonts w:ascii="Georgia" w:hAnsi="Georgia"/>
+        <w:t>Clauses 1, 7, 12, 15 and 16 survive termination.</w:t>
+      </w:r>
+    </w:p>
+    <w:p>
+      <w:pPr>
+        <w:keepNext/>
+        <w:spacing w:before="280" w:after="80"/>
+      </w:pPr>
+      <w:r>
+        <w:rPr>
+          <w:rFonts w:ascii="Calibri" w:hAnsi="Calibri"/>
           <w:b/>
           <w:i w:val="0"/>
-          <w:color w:val="1A1A1A"/>
-          <w:sz w:val="21"/>
-        </w:rPr>
-        <w:t>Counterparts.</w:t>
-      </w:r>
-      <w:r>
-        <w:rPr>
-          <w:rFonts w:ascii="Georgia" w:hAnsi="Georgia"/>
-          <w:b w:val="0"/>
-          <w:i w:val="0"/>
-          <w:color w:val="1A1A1A"/>
-          <w:sz w:val="21"/>
-        </w:rPr>
-        <w:t xml:space="preserve"> This Agreement may be executed in any number of counterparts, each of which is an original and all of which together constitute one agreement.</w:t>
+          <w:color w:val="0E2A47"/>
+          <w:sz w:val="23"/>
+        </w:rPr>
+        <w:t>15.</w:t>
+      </w:r>
+      <w:r>
+        <w:rPr>
+          <w:rFonts w:ascii="Calibri" w:hAnsi="Calibri"/>
+          <w:b/>
+          <w:i w:val="0"/>
+          <w:color w:val="0E2A47"/>
+          <w:sz w:val="23"/>
+        </w:rPr>
+        <w:t xml:space="preserve">   </w:t>
+      </w:r>
+      <w:r>
+        <w:rPr>
+          <w:rFonts w:ascii="Calibri" w:hAnsi="Calibri"/>
+          <w:b/>
+          <w:i w:val="0"/>
+          <w:color w:val="0E2A47"/>
+          <w:sz w:val="23"/>
+        </w:rPr>
+        <w:t>GOVERNING LAW AND JURISDICTION</w:t>
       </w:r>
     </w:p>
     <w:p>
@@ -4815,7 +4912,7 @@
           <w:color w:val="0E2A47"/>
           <w:sz w:val="21"/>
         </w:rPr>
-        <w:t>15.8</w:t>
+        <w:t>15.1</w:t>
       </w:r>
       <w:r>
         <w:rPr>
@@ -4835,6 +4932,7 @@
           <w:color w:val="1A1A1A"/>
           <w:sz w:val="21"/>
         </w:rPr>
+        <w:t xml:space="preserve">This Agreement and any non-contractual obligations arising out of or in connection with it are governed by, and shall be construed in accordance with, the </w:t>
       </w:r>
       <w:r>
         <w:rPr>
@@ -4844,7 +4942,7 @@
           <w:color w:val="1A1A1A"/>
           <w:sz w:val="21"/>
         </w:rPr>
-        <w:t>Notices.</w:t>
+        <w:t>federal laws of the United Arab Emirates as applied in the Emirate of Dubai</w:t>
       </w:r>
       <w:r>
         <w:rPr>
@@ -4854,7 +4952,7 @@
           <w:color w:val="1A1A1A"/>
           <w:sz w:val="21"/>
         </w:rPr>
-        <w:t xml:space="preserve"> Notices under this Agreement shall be in writing and delivered by hand, courier or email to the addresses of the Parties set out in this Agreement (or as notified in writing from time to time).</w:t>
+        <w:t>.</w:t>
       </w:r>
     </w:p>
     <w:p>
@@ -4871,7 +4969,605 @@
           <w:color w:val="0E2A47"/>
           <w:sz w:val="21"/>
         </w:rPr>
-        <w:t>15.9</w:t>
+        <w:t>15.2</w:t>
+      </w:r>
+      <w:r>
+        <w:rPr>
+          <w:rFonts w:ascii="Georgia" w:hAnsi="Georgia"/>
+          <w:b w:val="0"/>
+          <w:i w:val="0"/>
+          <w:color w:val="1A1A1A"/>
+          <w:sz w:val="21"/>
+        </w:rPr>
+        <w:tab/>
+      </w:r>
+      <w:r>
+        <w:rPr>
+          <w:rFonts w:ascii="Georgia" w:hAnsi="Georgia"/>
+          <w:b w:val="0"/>
+          <w:i w:val="0"/>
+          <w:color w:val="1A1A1A"/>
+          <w:sz w:val="21"/>
+        </w:rPr>
+        <w:t xml:space="preserve">The Parties irrevocably submit to the </w:t>
+      </w:r>
+      <w:r>
+        <w:rPr>
+          <w:rFonts w:ascii="Georgia" w:hAnsi="Georgia"/>
+          <w:b/>
+          <w:i w:val="0"/>
+          <w:color w:val="1A1A1A"/>
+          <w:sz w:val="21"/>
+        </w:rPr>
+        <w:t>exclusive jurisdiction of the Courts of Dubai</w:t>
+      </w:r>
+      <w:r>
+        <w:rPr>
+          <w:rFonts w:ascii="Georgia" w:hAnsi="Georgia"/>
+          <w:b w:val="0"/>
+          <w:i w:val="0"/>
+          <w:color w:val="1A1A1A"/>
+          <w:sz w:val="21"/>
+        </w:rPr>
+        <w:t xml:space="preserve"> in respect of any dispute arising out of or in connection with this Agreement, without prejudice to any mandatory requirement for notarisation or registration before the Notary Public and the DET.</w:t>
+      </w:r>
+    </w:p>
+    <w:p>
+      <w:pPr>
+        <w:spacing w:after="120"/>
+        <w:ind w:left="792" w:hanging="792"/>
+        <w:jc w:val="both"/>
+      </w:pPr>
+      <w:r>
+        <w:rPr>
+          <w:rFonts w:ascii="Georgia" w:hAnsi="Georgia"/>
+          <w:b/>
+          <w:i w:val="0"/>
+          <w:color w:val="0E2A47"/>
+          <w:sz w:val="21"/>
+        </w:rPr>
+        <w:t>15.3</w:t>
+      </w:r>
+      <w:r>
+        <w:rPr>
+          <w:rFonts w:ascii="Georgia" w:hAnsi="Georgia"/>
+          <w:b w:val="0"/>
+          <w:i w:val="0"/>
+          <w:color w:val="1A1A1A"/>
+          <w:sz w:val="21"/>
+        </w:rPr>
+        <w:tab/>
+      </w:r>
+      <w:r>
+        <w:rPr>
+          <w:rFonts w:ascii="Georgia" w:hAnsi="Georgia"/>
+          <w:b w:val="0"/>
+          <w:i w:val="0"/>
+          <w:color w:val="1A1A1A"/>
+          <w:sz w:val="21"/>
+        </w:rPr>
+        <w:t xml:space="preserve">The Parties may, by written agreement, elect to refer any dispute instead to arbitration administered by the </w:t>
+      </w:r>
+      <w:r>
+        <w:rPr>
+          <w:rFonts w:ascii="Georgia" w:hAnsi="Georgia"/>
+          <w:b/>
+          <w:i w:val="0"/>
+          <w:color w:val="1A1A1A"/>
+          <w:sz w:val="21"/>
+        </w:rPr>
+        <w:t>Dubai International Arbitration Centre (DIAC)</w:t>
+      </w:r>
+      <w:r>
+        <w:rPr>
+          <w:rFonts w:ascii="Georgia" w:hAnsi="Georgia"/>
+          <w:b w:val="0"/>
+          <w:i w:val="0"/>
+          <w:color w:val="1A1A1A"/>
+          <w:sz w:val="21"/>
+        </w:rPr>
+        <w:t>, seated in Dubai and conducted in the English language.</w:t>
+      </w:r>
+    </w:p>
+    <w:p>
+      <w:pPr>
+        <w:keepNext/>
+        <w:spacing w:before="280" w:after="80"/>
+      </w:pPr>
+      <w:r>
+        <w:rPr>
+          <w:rFonts w:ascii="Calibri" w:hAnsi="Calibri"/>
+          <w:b/>
+          <w:i w:val="0"/>
+          <w:color w:val="0E2A47"/>
+          <w:sz w:val="23"/>
+        </w:rPr>
+        <w:t>16.</w:t>
+      </w:r>
+      <w:r>
+        <w:rPr>
+          <w:rFonts w:ascii="Calibri" w:hAnsi="Calibri"/>
+          <w:b/>
+          <w:i w:val="0"/>
+          <w:color w:val="0E2A47"/>
+          <w:sz w:val="23"/>
+        </w:rPr>
+        <w:t xml:space="preserve">   </w:t>
+      </w:r>
+      <w:r>
+        <w:rPr>
+          <w:rFonts w:ascii="Calibri" w:hAnsi="Calibri"/>
+          <w:b/>
+          <w:i w:val="0"/>
+          <w:color w:val="0E2A47"/>
+          <w:sz w:val="23"/>
+        </w:rPr>
+        <w:t>GENERAL PROVISIONS</w:t>
+      </w:r>
+    </w:p>
+    <w:p>
+      <w:pPr>
+        <w:spacing w:after="120"/>
+        <w:ind w:left="792" w:hanging="792"/>
+        <w:jc w:val="both"/>
+      </w:pPr>
+      <w:r>
+        <w:rPr>
+          <w:rFonts w:ascii="Georgia" w:hAnsi="Georgia"/>
+          <w:b/>
+          <w:i w:val="0"/>
+          <w:color w:val="0E2A47"/>
+          <w:sz w:val="21"/>
+        </w:rPr>
+        <w:t>16.1</w:t>
+      </w:r>
+      <w:r>
+        <w:rPr>
+          <w:rFonts w:ascii="Georgia" w:hAnsi="Georgia"/>
+          <w:b w:val="0"/>
+          <w:i w:val="0"/>
+          <w:color w:val="1A1A1A"/>
+          <w:sz w:val="21"/>
+        </w:rPr>
+        <w:tab/>
+      </w:r>
+      <w:r>
+        <w:rPr>
+          <w:rFonts w:ascii="Georgia" w:hAnsi="Georgia"/>
+          <w:b w:val="0"/>
+          <w:i w:val="0"/>
+          <w:color w:val="1A1A1A"/>
+          <w:sz w:val="21"/>
+        </w:rPr>
+      </w:r>
+      <w:r>
+        <w:rPr>
+          <w:rFonts w:ascii="Georgia" w:hAnsi="Georgia"/>
+          <w:b/>
+          <w:i w:val="0"/>
+          <w:color w:val="1A1A1A"/>
+          <w:sz w:val="21"/>
+        </w:rPr>
+        <w:t>Entire Agreement.</w:t>
+      </w:r>
+      <w:r>
+        <w:rPr>
+          <w:rFonts w:ascii="Georgia" w:hAnsi="Georgia"/>
+          <w:b w:val="0"/>
+          <w:i w:val="0"/>
+          <w:color w:val="1A1A1A"/>
+          <w:sz w:val="21"/>
+        </w:rPr>
+        <w:t xml:space="preserve"> This Agreement constitutes the entire agreement between the Parties in relation to its subject matter and supersedes all prior arrangements and understandings.</w:t>
+      </w:r>
+    </w:p>
+    <w:p>
+      <w:pPr>
+        <w:spacing w:after="120"/>
+        <w:ind w:left="792" w:hanging="792"/>
+        <w:jc w:val="both"/>
+      </w:pPr>
+      <w:r>
+        <w:rPr>
+          <w:rFonts w:ascii="Georgia" w:hAnsi="Georgia"/>
+          <w:b/>
+          <w:i w:val="0"/>
+          <w:color w:val="0E2A47"/>
+          <w:sz w:val="21"/>
+        </w:rPr>
+        <w:t>16.2</w:t>
+      </w:r>
+      <w:r>
+        <w:rPr>
+          <w:rFonts w:ascii="Georgia" w:hAnsi="Georgia"/>
+          <w:b w:val="0"/>
+          <w:i w:val="0"/>
+          <w:color w:val="1A1A1A"/>
+          <w:sz w:val="21"/>
+        </w:rPr>
+        <w:tab/>
+      </w:r>
+      <w:r>
+        <w:rPr>
+          <w:rFonts w:ascii="Georgia" w:hAnsi="Georgia"/>
+          <w:b w:val="0"/>
+          <w:i w:val="0"/>
+          <w:color w:val="1A1A1A"/>
+          <w:sz w:val="21"/>
+        </w:rPr>
+      </w:r>
+      <w:r>
+        <w:rPr>
+          <w:rFonts w:ascii="Georgia" w:hAnsi="Georgia"/>
+          <w:b/>
+          <w:i w:val="0"/>
+          <w:color w:val="1A1A1A"/>
+          <w:sz w:val="21"/>
+        </w:rPr>
+        <w:t>Amendments.</w:t>
+      </w:r>
+      <w:r>
+        <w:rPr>
+          <w:rFonts w:ascii="Georgia" w:hAnsi="Georgia"/>
+          <w:b w:val="0"/>
+          <w:i w:val="0"/>
+          <w:color w:val="1A1A1A"/>
+          <w:sz w:val="21"/>
+        </w:rPr>
+        <w:t xml:space="preserve"> No amendment to this Agreement is effective unless in writing and signed by or on behalf of each Party; and any amendment to Clause 7 is further subject to Clause 7.8.</w:t>
+      </w:r>
+    </w:p>
+    <w:p>
+      <w:pPr>
+        <w:spacing w:after="120"/>
+        <w:ind w:left="792" w:hanging="792"/>
+        <w:jc w:val="both"/>
+      </w:pPr>
+      <w:r>
+        <w:rPr>
+          <w:rFonts w:ascii="Georgia" w:hAnsi="Georgia"/>
+          <w:b/>
+          <w:i w:val="0"/>
+          <w:color w:val="0E2A47"/>
+          <w:sz w:val="21"/>
+        </w:rPr>
+        <w:t>16.3</w:t>
+      </w:r>
+      <w:r>
+        <w:rPr>
+          <w:rFonts w:ascii="Georgia" w:hAnsi="Georgia"/>
+          <w:b w:val="0"/>
+          <w:i w:val="0"/>
+          <w:color w:val="1A1A1A"/>
+          <w:sz w:val="21"/>
+        </w:rPr>
+        <w:tab/>
+      </w:r>
+      <w:r>
+        <w:rPr>
+          <w:rFonts w:ascii="Georgia" w:hAnsi="Georgia"/>
+          <w:b w:val="0"/>
+          <w:i w:val="0"/>
+          <w:color w:val="1A1A1A"/>
+          <w:sz w:val="21"/>
+        </w:rPr>
+      </w:r>
+      <w:r>
+        <w:rPr>
+          <w:rFonts w:ascii="Georgia" w:hAnsi="Georgia"/>
+          <w:b/>
+          <w:i w:val="0"/>
+          <w:color w:val="1A1A1A"/>
+          <w:sz w:val="21"/>
+        </w:rPr>
+        <w:t>No Waiver.</w:t>
+      </w:r>
+      <w:r>
+        <w:rPr>
+          <w:rFonts w:ascii="Georgia" w:hAnsi="Georgia"/>
+          <w:b w:val="0"/>
+          <w:i w:val="0"/>
+          <w:color w:val="1A1A1A"/>
+          <w:sz w:val="21"/>
+        </w:rPr>
+        <w:t xml:space="preserve"> No failure or delay in exercising any right operates as a waiver of it.</w:t>
+      </w:r>
+    </w:p>
+    <w:p>
+      <w:pPr>
+        <w:spacing w:after="120"/>
+        <w:ind w:left="792" w:hanging="792"/>
+        <w:jc w:val="both"/>
+      </w:pPr>
+      <w:r>
+        <w:rPr>
+          <w:rFonts w:ascii="Georgia" w:hAnsi="Georgia"/>
+          <w:b/>
+          <w:i w:val="0"/>
+          <w:color w:val="0E2A47"/>
+          <w:sz w:val="21"/>
+        </w:rPr>
+        <w:t>16.4</w:t>
+      </w:r>
+      <w:r>
+        <w:rPr>
+          <w:rFonts w:ascii="Georgia" w:hAnsi="Georgia"/>
+          <w:b w:val="0"/>
+          <w:i w:val="0"/>
+          <w:color w:val="1A1A1A"/>
+          <w:sz w:val="21"/>
+        </w:rPr>
+        <w:tab/>
+      </w:r>
+      <w:r>
+        <w:rPr>
+          <w:rFonts w:ascii="Georgia" w:hAnsi="Georgia"/>
+          <w:b w:val="0"/>
+          <w:i w:val="0"/>
+          <w:color w:val="1A1A1A"/>
+          <w:sz w:val="21"/>
+        </w:rPr>
+      </w:r>
+      <w:r>
+        <w:rPr>
+          <w:rFonts w:ascii="Georgia" w:hAnsi="Georgia"/>
+          <w:b/>
+          <w:i w:val="0"/>
+          <w:color w:val="1A1A1A"/>
+          <w:sz w:val="21"/>
+        </w:rPr>
+        <w:t>Severability.</w:t>
+      </w:r>
+      <w:r>
+        <w:rPr>
+          <w:rFonts w:ascii="Georgia" w:hAnsi="Georgia"/>
+          <w:b w:val="0"/>
+          <w:i w:val="0"/>
+          <w:color w:val="1A1A1A"/>
+          <w:sz w:val="21"/>
+        </w:rPr>
+        <w:t xml:space="preserve"> If any provision is or becomes invalid or unenforceable, the remaining provisions continue in full force and the Parties shall negotiate in good faith to replace the invalid provision with a valid one of similar effect.</w:t>
+      </w:r>
+    </w:p>
+    <w:p>
+      <w:pPr>
+        <w:spacing w:after="120"/>
+        <w:ind w:left="792" w:hanging="792"/>
+        <w:jc w:val="both"/>
+      </w:pPr>
+      <w:r>
+        <w:rPr>
+          <w:rFonts w:ascii="Georgia" w:hAnsi="Georgia"/>
+          <w:b/>
+          <w:i w:val="0"/>
+          <w:color w:val="0E2A47"/>
+          <w:sz w:val="21"/>
+        </w:rPr>
+        <w:t>16.5</w:t>
+      </w:r>
+      <w:r>
+        <w:rPr>
+          <w:rFonts w:ascii="Georgia" w:hAnsi="Georgia"/>
+          <w:b w:val="0"/>
+          <w:i w:val="0"/>
+          <w:color w:val="1A1A1A"/>
+          <w:sz w:val="21"/>
+        </w:rPr>
+        <w:tab/>
+      </w:r>
+      <w:r>
+        <w:rPr>
+          <w:rFonts w:ascii="Georgia" w:hAnsi="Georgia"/>
+          <w:b w:val="0"/>
+          <w:i w:val="0"/>
+          <w:color w:val="1A1A1A"/>
+          <w:sz w:val="21"/>
+        </w:rPr>
+      </w:r>
+      <w:r>
+        <w:rPr>
+          <w:rFonts w:ascii="Georgia" w:hAnsi="Georgia"/>
+          <w:b/>
+          <w:i w:val="0"/>
+          <w:color w:val="1A1A1A"/>
+          <w:sz w:val="21"/>
+        </w:rPr>
+        <w:t>Assignment.</w:t>
+      </w:r>
+      <w:r>
+        <w:rPr>
+          <w:rFonts w:ascii="Georgia" w:hAnsi="Georgia"/>
+          <w:b w:val="0"/>
+          <w:i w:val="0"/>
+          <w:color w:val="1A1A1A"/>
+          <w:sz w:val="21"/>
+        </w:rPr>
+        <w:t xml:space="preserve"> No Party may assign or transfer its rights or obligations under this Agreement without the prior written consent of the Transferor (acting by the Founder).</w:t>
+      </w:r>
+    </w:p>
+    <w:p>
+      <w:pPr>
+        <w:spacing w:after="120"/>
+        <w:ind w:left="792" w:hanging="792"/>
+        <w:jc w:val="both"/>
+      </w:pPr>
+      <w:r>
+        <w:rPr>
+          <w:rFonts w:ascii="Georgia" w:hAnsi="Georgia"/>
+          <w:b/>
+          <w:i w:val="0"/>
+          <w:color w:val="0E2A47"/>
+          <w:sz w:val="21"/>
+        </w:rPr>
+        <w:t>16.6</w:t>
+      </w:r>
+      <w:r>
+        <w:rPr>
+          <w:rFonts w:ascii="Georgia" w:hAnsi="Georgia"/>
+          <w:b w:val="0"/>
+          <w:i w:val="0"/>
+          <w:color w:val="1A1A1A"/>
+          <w:sz w:val="21"/>
+        </w:rPr>
+        <w:tab/>
+      </w:r>
+      <w:r>
+        <w:rPr>
+          <w:rFonts w:ascii="Georgia" w:hAnsi="Georgia"/>
+          <w:b w:val="0"/>
+          <w:i w:val="0"/>
+          <w:color w:val="1A1A1A"/>
+          <w:sz w:val="21"/>
+        </w:rPr>
+      </w:r>
+      <w:r>
+        <w:rPr>
+          <w:rFonts w:ascii="Georgia" w:hAnsi="Georgia"/>
+          <w:b/>
+          <w:i w:val="0"/>
+          <w:color w:val="1A1A1A"/>
+          <w:sz w:val="21"/>
+        </w:rPr>
+        <w:t>Further Assurance.</w:t>
+      </w:r>
+      <w:r>
+        <w:rPr>
+          <w:rFonts w:ascii="Georgia" w:hAnsi="Georgia"/>
+          <w:b w:val="0"/>
+          <w:i w:val="0"/>
+          <w:color w:val="1A1A1A"/>
+          <w:sz w:val="21"/>
+        </w:rPr>
+        <w:t xml:space="preserve"> Each Party shall execute such further documents and do such further acts as may reasonably be required to give full effect to this Agreement, including the irrevocable proxies and powers of attorney referred to in Clause 7.3.</w:t>
+      </w:r>
+    </w:p>
+    <w:p>
+      <w:pPr>
+        <w:spacing w:after="120"/>
+        <w:ind w:left="792" w:hanging="792"/>
+        <w:jc w:val="both"/>
+      </w:pPr>
+      <w:r>
+        <w:rPr>
+          <w:rFonts w:ascii="Georgia" w:hAnsi="Georgia"/>
+          <w:b/>
+          <w:i w:val="0"/>
+          <w:color w:val="0E2A47"/>
+          <w:sz w:val="21"/>
+        </w:rPr>
+        <w:t>16.7</w:t>
+      </w:r>
+      <w:r>
+        <w:rPr>
+          <w:rFonts w:ascii="Georgia" w:hAnsi="Georgia"/>
+          <w:b w:val="0"/>
+          <w:i w:val="0"/>
+          <w:color w:val="1A1A1A"/>
+          <w:sz w:val="21"/>
+        </w:rPr>
+        <w:tab/>
+      </w:r>
+      <w:r>
+        <w:rPr>
+          <w:rFonts w:ascii="Georgia" w:hAnsi="Georgia"/>
+          <w:b w:val="0"/>
+          <w:i w:val="0"/>
+          <w:color w:val="1A1A1A"/>
+          <w:sz w:val="21"/>
+        </w:rPr>
+      </w:r>
+      <w:r>
+        <w:rPr>
+          <w:rFonts w:ascii="Georgia" w:hAnsi="Georgia"/>
+          <w:b/>
+          <w:i w:val="0"/>
+          <w:color w:val="1A1A1A"/>
+          <w:sz w:val="21"/>
+        </w:rPr>
+        <w:t>Counterparts.</w:t>
+      </w:r>
+      <w:r>
+        <w:rPr>
+          <w:rFonts w:ascii="Georgia" w:hAnsi="Georgia"/>
+          <w:b w:val="0"/>
+          <w:i w:val="0"/>
+          <w:color w:val="1A1A1A"/>
+          <w:sz w:val="21"/>
+        </w:rPr>
+        <w:t xml:space="preserve"> This Agreement may be executed in any number of counterparts, each of which is an original and all of which together constitute one agreement.</w:t>
+      </w:r>
+    </w:p>
+    <w:p>
+      <w:pPr>
+        <w:spacing w:after="120"/>
+        <w:ind w:left="792" w:hanging="792"/>
+        <w:jc w:val="both"/>
+      </w:pPr>
+      <w:r>
+        <w:rPr>
+          <w:rFonts w:ascii="Georgia" w:hAnsi="Georgia"/>
+          <w:b/>
+          <w:i w:val="0"/>
+          <w:color w:val="0E2A47"/>
+          <w:sz w:val="21"/>
+        </w:rPr>
+        <w:t>16.8</w:t>
+      </w:r>
+      <w:r>
+        <w:rPr>
+          <w:rFonts w:ascii="Georgia" w:hAnsi="Georgia"/>
+          <w:b w:val="0"/>
+          <w:i w:val="0"/>
+          <w:color w:val="1A1A1A"/>
+          <w:sz w:val="21"/>
+        </w:rPr>
+        <w:tab/>
+      </w:r>
+      <w:r>
+        <w:rPr>
+          <w:rFonts w:ascii="Georgia" w:hAnsi="Georgia"/>
+          <w:b w:val="0"/>
+          <w:i w:val="0"/>
+          <w:color w:val="1A1A1A"/>
+          <w:sz w:val="21"/>
+        </w:rPr>
+      </w:r>
+      <w:r>
+        <w:rPr>
+          <w:rFonts w:ascii="Georgia" w:hAnsi="Georgia"/>
+          <w:b/>
+          <w:i w:val="0"/>
+          <w:color w:val="1A1A1A"/>
+          <w:sz w:val="21"/>
+        </w:rPr>
+        <w:t>Notices.</w:t>
+      </w:r>
+      <w:r>
+        <w:rPr>
+          <w:rFonts w:ascii="Georgia" w:hAnsi="Georgia"/>
+          <w:b w:val="0"/>
+          <w:i w:val="0"/>
+          <w:color w:val="1A1A1A"/>
+          <w:sz w:val="21"/>
+        </w:rPr>
+        <w:t xml:space="preserve"> Notices under this Agreement shall be in writing and delivered by hand, courier or email to the addresses of the Parties set out in this Agreement (or as notified in writing from time to time).</w:t>
+      </w:r>
+    </w:p>
+    <w:p>
+      <w:pPr>
+        <w:spacing w:after="120"/>
+        <w:ind w:left="792" w:hanging="792"/>
+        <w:jc w:val="both"/>
+      </w:pPr>
+      <w:r>
+        <w:rPr>
+          <w:rFonts w:ascii="Georgia" w:hAnsi="Georgia"/>
+          <w:b/>
+          <w:i w:val="0"/>
+          <w:color w:val="0E2A47"/>
+          <w:sz w:val="21"/>
+        </w:rPr>
+        <w:t>16.9</w:t>
       </w:r>
       <w:r>
         <w:rPr>
@@ -8346,7 +9042,39 @@
           <w:color w:val="1A1A1A"/>
           <w:sz w:val="20"/>
         </w:rPr>
-        <w:t>Whether disputes are to be resolved by Dubai Courts (Clause 14.2) or DIAC arbitration (Clause 14.3).</w:t>
+        <w:t>Whether disputes are to be resolved by Dubai Courts (Clause 15.2) or DIAC arbitration (Clause 15.3).</w:t>
+      </w:r>
+    </w:p>
+    <w:p>
+      <w:pPr>
+        <w:pStyle w:val="ListBullet"/>
+        <w:spacing w:after="60"/>
+      </w:pPr>
+      <w:r>
+        <w:rPr>
+          <w:rFonts w:ascii="Georgia" w:hAnsi="Georgia"/>
+          <w:b w:val="0"/>
+          <w:i w:val="0"/>
+          <w:color w:val="1A1A1A"/>
+          <w:sz w:val="20"/>
+        </w:rPr>
+        <w:t>Whether to add a specific AED threshold to Reserved Matter 7.6(f) (asset disposals outside ordinary course).</w:t>
+      </w:r>
+    </w:p>
+    <w:p>
+      <w:pPr>
+        <w:pStyle w:val="ListBullet"/>
+        <w:spacing w:after="60"/>
+      </w:pPr>
+      <w:r>
+        <w:rPr>
+          <w:rFonts w:ascii="Georgia" w:hAnsi="Georgia"/>
+          <w:b w:val="0"/>
+          <w:i w:val="0"/>
+          <w:color w:val="1A1A1A"/>
+          <w:sz w:val="20"/>
+        </w:rPr>
+        <w:t>Confirmation that the amended MOA will entrench the Transferor's casting vote, Reserved Matters and sole right to appoint the General Manager (Clause 7.7).</w:t>
       </w:r>
     </w:p>
     <w:p>

</xml_diff>